<commit_message>
xóa output cũ, thêm đánh giá
</commit_message>
<xml_diff>
--- a/report/HLI_ViT5_final.docx
+++ b/report/HLI_ViT5_final.docx
@@ -3701,6 +3701,8 @@
         </w:rPr>
         <w:t>VĂN BẢN GỐC:</w:t>
       </w:r>
+      <w:bookmarkStart w:id="0" w:name="_GoBack"/>
+      <w:bookmarkEnd w:id="0"/>
     </w:p>
     <w:p>
       <w:pPr>
@@ -3730,27 +3732,18 @@
         <w:rPr>
           <w:rFonts w:ascii="Times New Roman" w:hAnsi="Times New Roman" w:cs="Times New Roman"/>
           <w:sz w:val="28"/>
-          <w:szCs w:val="28"/>
-          <w:lang w:val="vi-VN"/>
-        </w:rPr>
-      </w:pPr>
-      <w:r>
-        <w:rPr>
-          <w:rFonts w:ascii="Times New Roman" w:hAnsi="Times New Roman" w:cs="Times New Roman"/>
-          <w:sz w:val="28"/>
-          <w:szCs w:val="28"/>
-          <w:lang w:val="vi-VN"/>
-        </w:rPr>
-        <w:t xml:space="preserve">TÓM TẮT DO MODEL </w:t>
-      </w:r>
-      <w:r>
-        <w:rPr>
-          <w:rFonts w:ascii="Times New Roman" w:hAnsi="Times New Roman" w:cs="Times New Roman"/>
-          <w:sz w:val="28"/>
-          <w:szCs w:val="28"/>
-          <w:lang w:val="vi-VN"/>
-        </w:rPr>
-        <w:t>SINH:</w:t>
+          <w:szCs w:val="24"/>
+          <w:lang w:val="vi-VN"/>
+        </w:rPr>
+      </w:pPr>
+      <w:r>
+        <w:rPr>
+          <w:rFonts w:ascii="Times New Roman" w:hAnsi="Times New Roman" w:cs="Times New Roman"/>
+          <w:sz w:val="28"/>
+          <w:szCs w:val="24"/>
+          <w:lang w:val="vi-VN"/>
+        </w:rPr>
+        <w:t>TÓM TẮT THAM CHIẾU:</w:t>
       </w:r>
     </w:p>
     <w:p>
@@ -3772,9 +3765,41 @@
           <w:szCs w:val="24"/>
           <w:lang w:val="vi-VN"/>
         </w:rPr>
-        <w:t>&lt;</w:t>
-      </w:r>
-      <w:r>
+        <w:t>&lt;tóm tắt tham chiếu&gt;</w:t>
+      </w:r>
+    </w:p>
+    <w:p>
+      <w:pPr>
+        <w:ind w:left="5040"/>
+        <w:rPr>
+          <w:rFonts w:ascii="Times New Roman" w:hAnsi="Times New Roman" w:cs="Times New Roman"/>
+          <w:sz w:val="28"/>
+          <w:szCs w:val="28"/>
+          <w:lang w:val="vi-VN"/>
+        </w:rPr>
+      </w:pPr>
+      <w:r>
+        <w:rPr>
+          <w:rFonts w:ascii="Times New Roman" w:hAnsi="Times New Roman" w:cs="Times New Roman"/>
+          <w:sz w:val="28"/>
+          <w:szCs w:val="28"/>
+          <w:lang w:val="vi-VN"/>
+        </w:rPr>
+        <w:t xml:space="preserve">TÓM TẮT DO MODEL </w:t>
+      </w:r>
+      <w:r>
+        <w:rPr>
+          <w:rFonts w:ascii="Times New Roman" w:hAnsi="Times New Roman" w:cs="Times New Roman"/>
+          <w:sz w:val="28"/>
+          <w:szCs w:val="28"/>
+          <w:lang w:val="vi-VN"/>
+        </w:rPr>
+        <w:t>SINH:</w:t>
+      </w:r>
+    </w:p>
+    <w:p>
+      <w:pPr>
+        <w:ind w:left="5040"/>
         <w:rPr>
           <w:rFonts w:ascii="Times New Roman" w:hAnsi="Times New Roman" w:cs="Times New Roman"/>
           <w:i/>
@@ -3782,8 +3807,7 @@
           <w:szCs w:val="24"/>
           <w:lang w:val="vi-VN"/>
         </w:rPr>
-        <w:t>tóm tắt của model đó</w:t>
-      </w:r>
+      </w:pPr>
       <w:r>
         <w:rPr>
           <w:rFonts w:ascii="Times New Roman" w:hAnsi="Times New Roman" w:cs="Times New Roman"/>
@@ -3792,41 +3816,9 @@
           <w:szCs w:val="24"/>
           <w:lang w:val="vi-VN"/>
         </w:rPr>
-        <w:t>&gt;</w:t>
-      </w:r>
-    </w:p>
-    <w:p>
-      <w:pPr>
-        <w:ind w:left="5040"/>
-        <w:rPr>
-          <w:rFonts w:ascii="Times New Roman" w:hAnsi="Times New Roman" w:cs="Times New Roman"/>
-          <w:sz w:val="28"/>
-          <w:szCs w:val="28"/>
-          <w:lang w:val="vi-VN"/>
-        </w:rPr>
-      </w:pPr>
-      <w:r>
-        <w:rPr>
-          <w:rFonts w:ascii="Times New Roman" w:hAnsi="Times New Roman" w:cs="Times New Roman"/>
-          <w:sz w:val="28"/>
-          <w:szCs w:val="28"/>
-          <w:lang w:val="vi-VN"/>
-        </w:rPr>
-        <w:t xml:space="preserve">THỜI GIAN TÓM </w:t>
-      </w:r>
-      <w:r>
-        <w:rPr>
-          <w:rFonts w:ascii="Times New Roman" w:hAnsi="Times New Roman" w:cs="Times New Roman"/>
-          <w:sz w:val="28"/>
-          <w:szCs w:val="28"/>
-          <w:lang w:val="vi-VN"/>
-        </w:rPr>
-        <w:t>TẮT:</w:t>
-      </w:r>
-    </w:p>
-    <w:p>
-      <w:pPr>
-        <w:ind w:left="5040"/>
+        <w:t>&lt;</w:t>
+      </w:r>
+      <w:r>
         <w:rPr>
           <w:rFonts w:ascii="Times New Roman" w:hAnsi="Times New Roman" w:cs="Times New Roman"/>
           <w:i/>
@@ -3834,7 +3826,8 @@
           <w:szCs w:val="24"/>
           <w:lang w:val="vi-VN"/>
         </w:rPr>
-      </w:pPr>
+        <w:t>tóm tắt của model đó</w:t>
+      </w:r>
       <w:r>
         <w:rPr>
           <w:rFonts w:ascii="Times New Roman" w:hAnsi="Times New Roman" w:cs="Times New Roman"/>
@@ -3843,6 +3836,57 @@
           <w:szCs w:val="24"/>
           <w:lang w:val="vi-VN"/>
         </w:rPr>
+        <w:t>&gt;</w:t>
+      </w:r>
+    </w:p>
+    <w:p>
+      <w:pPr>
+        <w:ind w:left="5040"/>
+        <w:rPr>
+          <w:rFonts w:ascii="Times New Roman" w:hAnsi="Times New Roman" w:cs="Times New Roman"/>
+          <w:sz w:val="28"/>
+          <w:szCs w:val="28"/>
+          <w:lang w:val="vi-VN"/>
+        </w:rPr>
+      </w:pPr>
+      <w:r>
+        <w:rPr>
+          <w:rFonts w:ascii="Times New Roman" w:hAnsi="Times New Roman" w:cs="Times New Roman"/>
+          <w:sz w:val="28"/>
+          <w:szCs w:val="28"/>
+          <w:lang w:val="vi-VN"/>
+        </w:rPr>
+        <w:t xml:space="preserve">THỜI GIAN TÓM </w:t>
+      </w:r>
+      <w:r>
+        <w:rPr>
+          <w:rFonts w:ascii="Times New Roman" w:hAnsi="Times New Roman" w:cs="Times New Roman"/>
+          <w:sz w:val="28"/>
+          <w:szCs w:val="28"/>
+          <w:lang w:val="vi-VN"/>
+        </w:rPr>
+        <w:t>TẮT:</w:t>
+      </w:r>
+    </w:p>
+    <w:p>
+      <w:pPr>
+        <w:ind w:left="5040"/>
+        <w:rPr>
+          <w:rFonts w:ascii="Times New Roman" w:hAnsi="Times New Roman" w:cs="Times New Roman"/>
+          <w:i/>
+          <w:sz w:val="24"/>
+          <w:szCs w:val="24"/>
+          <w:lang w:val="vi-VN"/>
+        </w:rPr>
+      </w:pPr>
+      <w:r>
+        <w:rPr>
+          <w:rFonts w:ascii="Times New Roman" w:hAnsi="Times New Roman" w:cs="Times New Roman"/>
+          <w:i/>
+          <w:sz w:val="24"/>
+          <w:szCs w:val="24"/>
+          <w:lang w:val="vi-VN"/>
+        </w:rPr>
         <w:t>&lt;thời gian tóm tắt ghi ở đây&gt;</w:t>
       </w:r>
     </w:p>
@@ -3924,8 +3968,6 @@
         </w:rPr>
         <w:t>---Hết---</w:t>
       </w:r>
-      <w:bookmarkStart w:id="0" w:name="_GoBack"/>
-      <w:bookmarkEnd w:id="0"/>
     </w:p>
     <w:sectPr>
       <w:pgSz w:w="11906" w:h="16838" w:code="9"/>
@@ -4669,7 +4711,7 @@
 </file>
 
 <file path=customXml/itemProps1.xml><?xml version="1.0" encoding="utf-8"?>
-<ds:datastoreItem xmlns:ds="http://schemas.openxmlformats.org/officeDocument/2006/customXml" ds:itemID="{84F3DE61-CD59-4682-962A-E294FF926C77}">
+<ds:datastoreItem xmlns:ds="http://schemas.openxmlformats.org/officeDocument/2006/customXml" ds:itemID="{50D6F6A5-761A-426D-9870-F8CF853574FA}">
   <ds:schemaRefs>
     <ds:schemaRef ds:uri="http://schemas.openxmlformats.org/officeDocument/2006/bibliography"/>
   </ds:schemaRefs>

</xml_diff>